<commit_message>
Fix ingestion scripts, add GBFS polling, add sample data
</commit_message>
<xml_diff>
--- a/docs/Phase1_Project_Proposal.docx
+++ b/docs/Phase1_Project_Proposal.docx
@@ -405,7 +405,7 @@
           <w:bCs/>
           <w:color w:val="1F4E5F"/>
         </w:rPr>
-        <w:t xml:space="preserve">Data Source</w:t>
+        <w:t xml:space="preserve">Data Sources</w:t>
       </w:r>
     </w:p>
     <w:p>
@@ -420,7 +420,7 @@
           <w:sz w:val="22"/>
           <w:szCs w:val="22"/>
         </w:rPr>
-        <w:t xml:space="preserve">Primary source: </w:t>
+        <w:t xml:space="preserve">Primary source (historical trip data): </w:t>
       </w:r>
       <w:r>
         <w:rPr>
@@ -430,7 +430,7 @@
         </w:rPr>
         <w:t xml:space="preserve">Citi Bike's official System Data, published as monthly CSV files at </w:t>
       </w:r>
-      <w:hyperlink w:history="1" r:id="rIdrs1l7nozqhvuuomb60ejx">
+      <w:hyperlink w:history="1" r:id="rIdgvw2wxa9cecgk11zaoa5h">
         <w:r>
           <w:rPr>
             <w:rStyle w:val="Hyperlink"/>
@@ -447,7 +447,7 @@
           <w:sz w:val="22"/>
           <w:szCs w:val="22"/>
         </w:rPr>
-        <w:t xml:space="preserve">, an open, public Amazon S3 bucket requiring no authentication. Files follow the naming pattern YYYYMM-citibike-tripdata.csv.zip (e.g., 202401-citibike-tripdata.csv.zip), each containing all completed trips for that month across New York City. Fields include ride_id, rideable_type, started_at, ended_at, start and end station name/ID, start and end latitude/longitude, and member_casual.</w:t>
+        <w:t xml:space="preserve">, an open, public Amazon S3 bucket requiring no authentication. Files follow the naming pattern &lt;YYYYMM&gt;-citibike-tripdata.csv.zip or &lt;YYYYMM&gt;-citibike-tripdata.zip (the exact extension varies by month, so the ingestion script checks both), each containing all completed trips for that month across New York City. Months with more than approximately one million trips are split across multiple CSVs within the same zip archive; the ingestion script accounts for this by concatenating all CSV parts found. Fields include ride_id, rideable_type, started_at, ended_at, start and end station name/ID, start and end latitude/longitude, and member_casual.</w:t>
       </w:r>
     </w:p>
     <w:p>
@@ -462,15 +462,15 @@
           <w:sz w:val="22"/>
           <w:szCs w:val="22"/>
         </w:rPr>
-        <w:t xml:space="preserve">Secondary source (supplementary): </w:t>
-      </w:r>
-      <w:r>
-        <w:rPr>
-          <w:rFonts w:ascii="Calibri" w:cs="Calibri" w:eastAsia="Calibri" w:hAnsi="Calibri"/>
-          <w:sz w:val="22"/>
-          <w:szCs w:val="22"/>
-        </w:rPr>
-        <w:t xml:space="preserve">Citi Bike's real-time General Bikeshare Feed Specification (GBFS) feed, a live JSON API exposing current station status. This may be incorporated as a second, API-based incremental stream in addition to the file-based monthly releases.</w:t>
+        <w:t xml:space="preserve">Secondary source (live station data): </w:t>
+      </w:r>
+      <w:r>
+        <w:rPr>
+          <w:rFonts w:ascii="Calibri" w:cs="Calibri" w:eastAsia="Calibri" w:hAnsi="Calibri"/>
+          <w:sz w:val="22"/>
+          <w:szCs w:val="22"/>
+        </w:rPr>
+        <w:t xml:space="preserve">Citi Bike's real-time General Bikeshare Feed Specification (GBFS) feed (auto-discovery endpoint at gbfs.citibikenyc.com/gbfs/gbfs.json), a live JSON API exposing current station-level bike and dock availability. This feed is polled hourly and forms a genuinely time-varying data source distinct from the monthly trip-history releases.</w:t>
       </w:r>
     </w:p>
     <w:p>
@@ -502,25 +502,43 @@
           <w:sz w:val="22"/>
           <w:szCs w:val="22"/>
         </w:rPr>
-        <w:t xml:space="preserve">Full Load: The historical baseline will be constructed by ingesting a defined window of monthly trip files (initially twelve months, reducible to six if resource constraints require) as the Bronze-layer historical dataset.</w:t>
-      </w:r>
-    </w:p>
-    <w:p>
-      <w:pPr>
-        <w:pStyle w:val="ListParagraph"/>
-        <w:numPr>
-          <w:ilvl w:val="0"/>
-          <w:numId w:val="2"/>
-        </w:numPr>
-        <w:spacing w:after="100" w:line="276"/>
-      </w:pPr>
-      <w:r>
-        <w:rPr>
-          <w:rFonts w:ascii="Calibri" w:cs="Calibri" w:eastAsia="Calibri" w:hAnsi="Calibri"/>
-          <w:sz w:val="22"/>
-          <w:szCs w:val="22"/>
-        </w:rPr>
-        <w:t xml:space="preserve">Incremental Load: Citi Bike publishes a new monthly file on a regular cadence shortly after each month-end. The pipeline will treat the newest published month(s) as the incremental feed, appending new records into Bronze and reconciling them into Silver and Gold. The GBFS feed, if incorporated, provides an additional real-time incremental source polled on a daily or hourly basis.</w:t>
+        <w:t xml:space="preserve">Full Load: The historical baseline consists of the most recent six complete months of trip data at the time the pipeline is first run. This window is determined dynamically (by checking backward from the most recently published month) rather than fixed to a specific past year, ensuring the baseline always reflects recent, current ridership rather than a stale historical snapshot.</w:t>
+      </w:r>
+    </w:p>
+    <w:p>
+      <w:pPr>
+        <w:pStyle w:val="ListParagraph"/>
+        <w:numPr>
+          <w:ilvl w:val="0"/>
+          <w:numId w:val="2"/>
+        </w:numPr>
+        <w:spacing w:after="100" w:line="276"/>
+      </w:pPr>
+      <w:r>
+        <w:rPr>
+          <w:rFonts w:ascii="Calibri" w:cs="Calibri" w:eastAsia="Calibri" w:hAnsi="Calibri"/>
+          <w:sz w:val="22"/>
+          <w:szCs w:val="22"/>
+        </w:rPr>
+        <w:t xml:space="preserve">Incremental Load (monthly): Citi Bike publishes a new monthly trip-history file shortly after each month-end. The pipeline tracks which months have already been ingested via a manifest file and, on each subsequent run, ingests only the next newly published month as an incremental batch, appending it into Bronze and reconciling it into Silver and Gold.</w:t>
+      </w:r>
+    </w:p>
+    <w:p>
+      <w:pPr>
+        <w:pStyle w:val="ListParagraph"/>
+        <w:numPr>
+          <w:ilvl w:val="0"/>
+          <w:numId w:val="2"/>
+        </w:numPr>
+        <w:spacing w:after="100" w:line="276"/>
+      </w:pPr>
+      <w:r>
+        <w:rPr>
+          <w:rFonts w:ascii="Calibri" w:cs="Calibri" w:eastAsia="Calibri" w:hAnsi="Calibri"/>
+          <w:sz w:val="22"/>
+          <w:szCs w:val="22"/>
+        </w:rPr>
+        <w:t xml:space="preserve">Incremental Load (hourly, live): The GBFS station_status feed is polled once per hour, with each poll appended as a new, timestamped snapshot. This provides a continuously updating incremental stream that changes on a much shorter cycle than the monthly trip files, strengthening the project's demonstration of true incremental ingestion.</w:t>
       </w:r>
     </w:p>
     <w:p>
@@ -533,7 +551,7 @@
           <w:sz w:val="22"/>
           <w:szCs w:val="22"/>
         </w:rPr>
-        <w:t xml:space="preserve">This satisfies the dual-load requirement using a single trusted, authoritative source: the historical S3 archive constitutes the full load, and the most recently published month (or the GBFS feed) constitutes the incremental load, eliminating schema-mismatch risk between the two.</w:t>
+        <w:t xml:space="preserve">This satisfies the dual-load requirement with two complementary mechanisms from the same authoritative source family: the historical S3 trip-history archive supplies the full load and monthly incremental batches, while the GBFS feed supplies a live, hourly incremental stream.</w:t>
       </w:r>
     </w:p>
     <w:p>
@@ -584,7 +602,7 @@
           <w:sz w:val="22"/>
           <w:szCs w:val="22"/>
         </w:rPr>
-        <w:t xml:space="preserve">The following files were selected to represent the two required load types:</w:t>
+        <w:t xml:space="preserve">The following files were selected to represent the required load types (exact months shift forward over time, since the ingestion script always targets recent, currently available data rather than a fixed past period):</w:t>
       </w:r>
     </w:p>
     <w:tbl>
@@ -600,8 +618,8 @@
         </w:tblBorders>
       </w:tblPr>
       <w:tblGrid>
-        <w:gridCol w:w="2400"/>
-        <w:gridCol w:w="4200"/>
+        <w:gridCol w:w="2600"/>
+        <w:gridCol w:w="4000"/>
         <w:gridCol w:w="3060"/>
       </w:tblGrid>
       <w:tr>
@@ -610,7 +628,7 @@
         </w:trPr>
         <w:tc>
           <w:tcPr>
-            <w:tcW w:type="dxa" w:w="2400"/>
+            <w:tcW w:type="dxa" w:w="2600"/>
             <w:shd w:fill="1F4E5F" w:color="auto" w:val="clear"/>
             <w:tcMar>
               <w:top w:type="dxa" w:w="100"/>
@@ -635,7 +653,7 @@
         </w:tc>
         <w:tc>
           <w:tcPr>
-            <w:tcW w:type="dxa" w:w="4200"/>
+            <w:tcW w:type="dxa" w:w="4000"/>
             <w:shd w:fill="1F4E5F" w:color="auto" w:val="clear"/>
             <w:tcMar>
               <w:top w:type="dxa" w:w="100"/>
@@ -687,7 +705,7 @@
       <w:tr>
         <w:tc>
           <w:tcPr>
-            <w:tcW w:type="dxa" w:w="2400"/>
+            <w:tcW w:type="dxa" w:w="2600"/>
             <w:tcMar>
               <w:top w:type="dxa" w:w="100"/>
               <w:left w:type="dxa" w:w="120"/>
@@ -711,7 +729,7 @@
         </w:tc>
         <w:tc>
           <w:tcPr>
-            <w:tcW w:type="dxa" w:w="4200"/>
+            <w:tcW w:type="dxa" w:w="4000"/>
             <w:tcMar>
               <w:top w:type="dxa" w:w="100"/>
               <w:left w:type="dxa" w:w="120"/>
@@ -729,7 +747,7 @@
                 <w:sz w:val="20"/>
                 <w:szCs w:val="20"/>
               </w:rPr>
-              <w:t xml:space="preserve">Twelve months of historical trip records (January 2024 – December 2024)</w:t>
+              <w:t xml:space="preserve">The 6 most recent complete months of trip records at the time the pipeline is first run</w:t>
             </w:r>
           </w:p>
         </w:tc>
@@ -753,7 +771,7 @@
                 <w:sz w:val="20"/>
                 <w:szCs w:val="20"/>
               </w:rPr>
-              <w:t xml:space="preserve">202401-citibike-tripdata.csv.zip through 202412-citibike-tripdata.csv.zip</w:t>
+              <w:t xml:space="preserve">&lt;YYYYMM&gt;-citibike-tripdata.csv.zip or .zip, for each of the 6 months</w:t>
             </w:r>
           </w:p>
         </w:tc>
@@ -761,7 +779,7 @@
       <w:tr>
         <w:tc>
           <w:tcPr>
-            <w:tcW w:type="dxa" w:w="2400"/>
+            <w:tcW w:type="dxa" w:w="2600"/>
             <w:tcMar>
               <w:top w:type="dxa" w:w="100"/>
               <w:left w:type="dxa" w:w="120"/>
@@ -779,13 +797,13 @@
                 <w:sz w:val="20"/>
                 <w:szCs w:val="20"/>
               </w:rPr>
-              <w:t xml:space="preserve">Incremental Load</w:t>
+              <w:t xml:space="preserve">Incremental Load (monthly)</w:t>
             </w:r>
           </w:p>
         </w:tc>
         <w:tc>
           <w:tcPr>
-            <w:tcW w:type="dxa" w:w="4200"/>
+            <w:tcW w:type="dxa" w:w="4000"/>
             <w:tcMar>
               <w:top w:type="dxa" w:w="100"/>
               <w:left w:type="dxa" w:w="120"/>
@@ -803,7 +821,7 @@
                 <w:sz w:val="20"/>
                 <w:szCs w:val="20"/>
               </w:rPr>
-              <w:t xml:space="preserve">The subsequent month's trip records, not present in the baseline (January 2025)</w:t>
+              <w:t xml:space="preserve">The next month's trip records, not present in the baseline, ingested on each subsequent run</w:t>
             </w:r>
           </w:p>
         </w:tc>
@@ -827,7 +845,81 @@
                 <w:sz w:val="20"/>
                 <w:szCs w:val="20"/>
               </w:rPr>
-              <w:t xml:space="preserve">202501-citibike-tripdata.csv.zip</w:t>
+              <w:t xml:space="preserve">&lt;YYYYMM&gt;-citibike-tripdata.csv.zip or .zip, for the newly published month</w:t>
+            </w:r>
+          </w:p>
+        </w:tc>
+      </w:tr>
+      <w:tr>
+        <w:tc>
+          <w:tcPr>
+            <w:tcW w:type="dxa" w:w="2600"/>
+            <w:tcMar>
+              <w:top w:type="dxa" w:w="100"/>
+              <w:left w:type="dxa" w:w="120"/>
+              <w:bottom w:type="dxa" w:w="100"/>
+              <w:right w:type="dxa" w:w="120"/>
+            </w:tcMar>
+          </w:tcPr>
+          <w:p>
+            <w:r>
+              <w:rPr>
+                <w:rFonts w:ascii="Calibri" w:cs="Calibri" w:eastAsia="Calibri" w:hAnsi="Calibri"/>
+                <w:b w:val="false"/>
+                <w:bCs w:val="false"/>
+                <w:color w:val="000000"/>
+                <w:sz w:val="20"/>
+                <w:szCs w:val="20"/>
+              </w:rPr>
+              <w:t xml:space="preserve">Incremental Load (hourly, live)</w:t>
+            </w:r>
+          </w:p>
+        </w:tc>
+        <w:tc>
+          <w:tcPr>
+            <w:tcW w:type="dxa" w:w="4000"/>
+            <w:tcMar>
+              <w:top w:type="dxa" w:w="100"/>
+              <w:left w:type="dxa" w:w="120"/>
+              <w:bottom w:type="dxa" w:w="100"/>
+              <w:right w:type="dxa" w:w="120"/>
+            </w:tcMar>
+          </w:tcPr>
+          <w:p>
+            <w:r>
+              <w:rPr>
+                <w:rFonts w:ascii="Calibri" w:cs="Calibri" w:eastAsia="Calibri" w:hAnsi="Calibri"/>
+                <w:b w:val="false"/>
+                <w:bCs w:val="false"/>
+                <w:color w:val="000000"/>
+                <w:sz w:val="20"/>
+                <w:szCs w:val="20"/>
+              </w:rPr>
+              <w:t xml:space="preserve">Station-level bike/dock availability, polled once per hour and appended as a new snapshot</w:t>
+            </w:r>
+          </w:p>
+        </w:tc>
+        <w:tc>
+          <w:tcPr>
+            <w:tcW w:type="dxa" w:w="3060"/>
+            <w:tcMar>
+              <w:top w:type="dxa" w:w="100"/>
+              <w:left w:type="dxa" w:w="120"/>
+              <w:bottom w:type="dxa" w:w="100"/>
+              <w:right w:type="dxa" w:w="120"/>
+            </w:tcMar>
+          </w:tcPr>
+          <w:p>
+            <w:r>
+              <w:rPr>
+                <w:rFonts w:ascii="Calibri" w:cs="Calibri" w:eastAsia="Calibri" w:hAnsi="Calibri"/>
+                <w:b w:val="false"/>
+                <w:bCs w:val="false"/>
+                <w:color w:val="000000"/>
+                <w:sz w:val="20"/>
+                <w:szCs w:val="20"/>
+              </w:rPr>
+              <w:t xml:space="preserve">GBFS station_status feed, resolved via gbfs.citibikenyc.com/gbfs/gbfs.json</w:t>
             </w:r>
           </w:p>
         </w:tc>
@@ -848,7 +940,7 @@
           <w:sz w:val="22"/>
           <w:szCs w:val="22"/>
         </w:rPr>
-        <w:t xml:space="preserve">This structure reflects a realistic production scenario: a historical baseline is ingested once, and each newly published month is subsequently ingested as an incremental batch.</w:t>
+        <w:t xml:space="preserve">This structure reflects a realistic production scenario: a recent historical baseline is ingested once, each newly published month is subsequently ingested as an incremental batch, and the live GBFS feed provides a continuously updating incremental stream on a much shorter (hourly) cycle.</w:t>
       </w:r>
     </w:p>
     <w:p>
@@ -888,79 +980,97 @@
           <w:sz w:val="22"/>
           <w:szCs w:val="22"/>
         </w:rPr>
-        <w:t xml:space="preserve">Each trip record contains approximately thirteen fields (ride identifier, timestamps, station names and IDs, coordinates, rideable type, and membership status). Based on this schema and observed row counts, the following volumes are estimated:</w:t>
-      </w:r>
-    </w:p>
-    <w:p>
-      <w:pPr>
-        <w:pStyle w:val="ListParagraph"/>
-        <w:numPr>
-          <w:ilvl w:val="0"/>
-          <w:numId w:val="2"/>
-        </w:numPr>
-        <w:spacing w:after="100" w:line="276"/>
-      </w:pPr>
-      <w:r>
-        <w:rPr>
-          <w:rFonts w:ascii="Calibri" w:cs="Calibri" w:eastAsia="Calibri" w:hAnsi="Calibri"/>
-          <w:sz w:val="22"/>
-          <w:szCs w:val="22"/>
-        </w:rPr>
-        <w:t xml:space="preserve">Single month, uncompressed: approximately 300–850 MB, depending on seasonal ridership</w:t>
-      </w:r>
-    </w:p>
-    <w:p>
-      <w:pPr>
-        <w:pStyle w:val="ListParagraph"/>
-        <w:numPr>
-          <w:ilvl w:val="0"/>
-          <w:numId w:val="2"/>
-        </w:numPr>
-        <w:spacing w:after="100" w:line="276"/>
-      </w:pPr>
-      <w:r>
-        <w:rPr>
-          <w:rFonts w:ascii="Calibri" w:cs="Calibri" w:eastAsia="Calibri" w:hAnsi="Calibri"/>
-          <w:sz w:val="22"/>
-          <w:szCs w:val="22"/>
-        </w:rPr>
-        <w:t xml:space="preserve">Single month, compressed (as distributed): approximately 60–150 MB</w:t>
-      </w:r>
-    </w:p>
-    <w:p>
-      <w:pPr>
-        <w:pStyle w:val="ListParagraph"/>
-        <w:numPr>
-          <w:ilvl w:val="0"/>
-          <w:numId w:val="2"/>
-        </w:numPr>
-        <w:spacing w:after="100" w:line="276"/>
-      </w:pPr>
-      <w:r>
-        <w:rPr>
-          <w:rFonts w:ascii="Calibri" w:cs="Calibri" w:eastAsia="Calibri" w:hAnsi="Calibri"/>
-          <w:sz w:val="22"/>
-          <w:szCs w:val="22"/>
-        </w:rPr>
-        <w:t xml:space="preserve">Full-load baseline (12 months, compressed): approximately 1–1.8 GB compressed, expanding to approximately 4–6 GB uncompressed once loaded</w:t>
-      </w:r>
-    </w:p>
-    <w:p>
-      <w:pPr>
-        <w:pStyle w:val="ListParagraph"/>
-        <w:numPr>
-          <w:ilvl w:val="0"/>
-          <w:numId w:val="2"/>
-        </w:numPr>
-        <w:spacing w:after="100" w:line="276"/>
-      </w:pPr>
-      <w:r>
-        <w:rPr>
-          <w:rFonts w:ascii="Calibri" w:cs="Calibri" w:eastAsia="Calibri" w:hAnsi="Calibri"/>
-          <w:sz w:val="22"/>
-          <w:szCs w:val="22"/>
-        </w:rPr>
-        <w:t xml:space="preserve">Incremental load (single month): approximately 60–150 MB compressed, published on a monthly cadence</w:t>
+        <w:t xml:space="preserve">Each trip record contains approximately thirteen fields (ride identifier, timestamps, station names and IDs, coordinates, rideable type, and membership status). Critically, months with more than roughly one million trips are distributed as multiple CSV files within a single zip archive rather than one file per month, which increases the effective per-month footprint. Based on this, the following volumes are estimated:</w:t>
+      </w:r>
+    </w:p>
+    <w:p>
+      <w:pPr>
+        <w:pStyle w:val="ListParagraph"/>
+        <w:numPr>
+          <w:ilvl w:val="0"/>
+          <w:numId w:val="2"/>
+        </w:numPr>
+        <w:spacing w:after="100" w:line="276"/>
+      </w:pPr>
+      <w:r>
+        <w:rPr>
+          <w:rFonts w:ascii="Calibri" w:cs="Calibri" w:eastAsia="Calibri" w:hAnsi="Calibri"/>
+          <w:sz w:val="22"/>
+          <w:szCs w:val="22"/>
+        </w:rPr>
+        <w:t xml:space="preserve">Single month, uncompressed (all CSV parts combined): approximately 370 MB – 1 GB, depending on seasonal ridership</w:t>
+      </w:r>
+    </w:p>
+    <w:p>
+      <w:pPr>
+        <w:pStyle w:val="ListParagraph"/>
+        <w:numPr>
+          <w:ilvl w:val="0"/>
+          <w:numId w:val="2"/>
+        </w:numPr>
+        <w:spacing w:after="100" w:line="276"/>
+      </w:pPr>
+      <w:r>
+        <w:rPr>
+          <w:rFonts w:ascii="Calibri" w:cs="Calibri" w:eastAsia="Calibri" w:hAnsi="Calibri"/>
+          <w:sz w:val="22"/>
+          <w:szCs w:val="22"/>
+        </w:rPr>
+        <w:t xml:space="preserve">Single month, compressed (as distributed): approximately 150–350 MB</w:t>
+      </w:r>
+    </w:p>
+    <w:p>
+      <w:pPr>
+        <w:pStyle w:val="ListParagraph"/>
+        <w:numPr>
+          <w:ilvl w:val="0"/>
+          <w:numId w:val="2"/>
+        </w:numPr>
+        <w:spacing w:after="100" w:line="276"/>
+      </w:pPr>
+      <w:r>
+        <w:rPr>
+          <w:rFonts w:ascii="Calibri" w:cs="Calibri" w:eastAsia="Calibri" w:hAnsi="Calibri"/>
+          <w:sz w:val="22"/>
+          <w:szCs w:val="22"/>
+        </w:rPr>
+        <w:t xml:space="preserve">Full-load baseline (6 months, compressed): approximately 1–2 GB compressed, expanding to approximately 2.5–5 GB uncompressed once loaded</w:t>
+      </w:r>
+    </w:p>
+    <w:p>
+      <w:pPr>
+        <w:pStyle w:val="ListParagraph"/>
+        <w:numPr>
+          <w:ilvl w:val="0"/>
+          <w:numId w:val="2"/>
+        </w:numPr>
+        <w:spacing w:after="100" w:line="276"/>
+      </w:pPr>
+      <w:r>
+        <w:rPr>
+          <w:rFonts w:ascii="Calibri" w:cs="Calibri" w:eastAsia="Calibri" w:hAnsi="Calibri"/>
+          <w:sz w:val="22"/>
+          <w:szCs w:val="22"/>
+        </w:rPr>
+        <w:t xml:space="preserve">Incremental load (single month): approximately 150–350 MB compressed, published on a monthly cadence</w:t>
+      </w:r>
+    </w:p>
+    <w:p>
+      <w:pPr>
+        <w:pStyle w:val="ListParagraph"/>
+        <w:numPr>
+          <w:ilvl w:val="0"/>
+          <w:numId w:val="2"/>
+        </w:numPr>
+        <w:spacing w:after="100" w:line="276"/>
+      </w:pPr>
+      <w:r>
+        <w:rPr>
+          <w:rFonts w:ascii="Calibri" w:cs="Calibri" w:eastAsia="Calibri" w:hAnsi="Calibri"/>
+          <w:sz w:val="22"/>
+          <w:szCs w:val="22"/>
+        </w:rPr>
+        <w:t xml:space="preserve">Incremental load (GBFS, hourly): a few hundred KB per poll (one row per station, roughly 2,000 stations); accumulates to a few MB per week of continuous polling</w:t>
       </w:r>
     </w:p>
     <w:p>
@@ -973,7 +1083,7 @@
           <w:sz w:val="22"/>
           <w:szCs w:val="22"/>
         </w:rPr>
-        <w:t xml:space="preserve">These figures are estimated from row-count and schema analysis and will be confirmed against actual file sizes upon download.</w:t>
+        <w:t xml:space="preserve">These figures were revised after confirming that Citi Bike splits high-volume months into multiple CSV parts per zip archive; the original estimate assumed a single CSV per month and understated the true footprint.</w:t>
       </w:r>
     </w:p>
     <w:p>
@@ -1000,43 +1110,61 @@
           <w:sz w:val="22"/>
           <w:szCs w:val="22"/>
         </w:rPr>
-        <w:t xml:space="preserve">The estimated full-load volume (4–6 GB uncompressed) is within the operating limits of Databricks Community Edition and Azure for Students. Two constraints were identified and addressed in project scoping:</w:t>
-      </w:r>
-    </w:p>
-    <w:p>
-      <w:pPr>
-        <w:pStyle w:val="ListParagraph"/>
-        <w:numPr>
-          <w:ilvl w:val="0"/>
-          <w:numId w:val="2"/>
-        </w:numPr>
-        <w:spacing w:after="100" w:line="276"/>
-      </w:pPr>
-      <w:r>
-        <w:rPr>
-          <w:rFonts w:ascii="Calibri" w:cs="Calibri" w:eastAsia="Calibri" w:hAnsi="Calibri"/>
-          <w:sz w:val="22"/>
-          <w:szCs w:val="22"/>
-        </w:rPr>
-        <w:t xml:space="preserve">Repository size: GitHub restricts individual file uploads to 100 MB without Git LFS. Accordingly, only trimmed samples (the first 50,000 rows of one full-load month and of the incremental month) will be committed to the repository for reference; complete raw files will be retrieved directly from the S3 source at pipeline runtime.</w:t>
-      </w:r>
-    </w:p>
-    <w:p>
-      <w:pPr>
-        <w:pStyle w:val="ListParagraph"/>
-        <w:numPr>
-          <w:ilvl w:val="0"/>
-          <w:numId w:val="2"/>
-        </w:numPr>
-        <w:spacing w:after="100" w:line="276"/>
-      </w:pPr>
-      <w:r>
-        <w:rPr>
-          <w:rFonts w:ascii="Calibri" w:cs="Calibri" w:eastAsia="Calibri" w:hAnsi="Calibri"/>
-          <w:sz w:val="22"/>
-          <w:szCs w:val="22"/>
-        </w:rPr>
-        <w:t xml:space="preserve">Baseline scope: Should the twelve-month baseline prove too resource-intensive during development, the window will be reduced to six months, still providing a multi-gigabyte dataset sufficient to justify distributed processing while reducing compute and storage load.</w:t>
+        <w:t xml:space="preserve">The estimated full-load volume (2.5–5 GB uncompressed) is within the operating limits of Databricks Community Edition and Azure for Students. Three constraints were identified and addressed in project scoping:</w:t>
+      </w:r>
+    </w:p>
+    <w:p>
+      <w:pPr>
+        <w:pStyle w:val="ListParagraph"/>
+        <w:numPr>
+          <w:ilvl w:val="0"/>
+          <w:numId w:val="2"/>
+        </w:numPr>
+        <w:spacing w:after="100" w:line="276"/>
+      </w:pPr>
+      <w:r>
+        <w:rPr>
+          <w:rFonts w:ascii="Calibri" w:cs="Calibri" w:eastAsia="Calibri" w:hAnsi="Calibri"/>
+          <w:sz w:val="22"/>
+          <w:szCs w:val="22"/>
+        </w:rPr>
+        <w:t xml:space="preserve">Repository size: GitHub restricts individual file uploads to 100 MB without Git LFS. Accordingly, only trimmed samples (the first 50,000 rows of one full-load month, the incremental month, and an initial GBFS poll) are committed to the repository for reference; complete raw files are retrieved directly from source at pipeline runtime and are excluded from version control.</w:t>
+      </w:r>
+    </w:p>
+    <w:p>
+      <w:pPr>
+        <w:pStyle w:val="ListParagraph"/>
+        <w:numPr>
+          <w:ilvl w:val="0"/>
+          <w:numId w:val="2"/>
+        </w:numPr>
+        <w:spacing w:after="100" w:line="276"/>
+      </w:pPr>
+      <w:r>
+        <w:rPr>
+          <w:rFonts w:ascii="Calibri" w:cs="Calibri" w:eastAsia="Calibri" w:hAnsi="Calibri"/>
+          <w:sz w:val="22"/>
+          <w:szCs w:val="22"/>
+        </w:rPr>
+        <w:t xml:space="preserve">Baseline scope: the full-load baseline is deliberately limited to 6 months (rather than a full year) specifically to stay within Databricks Free Edition storage and compute limits, per course guidance.</w:t>
+      </w:r>
+    </w:p>
+    <w:p>
+      <w:pPr>
+        <w:pStyle w:val="ListParagraph"/>
+        <w:numPr>
+          <w:ilvl w:val="0"/>
+          <w:numId w:val="2"/>
+        </w:numPr>
+        <w:spacing w:after="100" w:line="276"/>
+      </w:pPr>
+      <w:r>
+        <w:rPr>
+          <w:rFonts w:ascii="Calibri" w:cs="Calibri" w:eastAsia="Calibri" w:hAnsi="Calibri"/>
+          <w:sz w:val="22"/>
+          <w:szCs w:val="22"/>
+        </w:rPr>
+        <w:t xml:space="preserve">GBFS accumulation: because the hourly poll grows a single CSV indefinitely, this file is also excluded from version control and instead regenerated locally; only a small representative sample is committed.</w:t>
       </w:r>
     </w:p>
     <w:p>

</xml_diff>